<commit_message>
fixed to weather 2
</commit_message>
<xml_diff>
--- a/docs/common_code/06_pivotting/pivotting.docx
+++ b/docs/common_code/06_pivotting/pivotting.docx
@@ -31,7 +31,7 @@
         <w:pStyle w:val="Date"/>
       </w:pPr>
       <w:r>
-        <w:t xml:space="preserve">2026-10-01</w:t>
+        <w:t xml:space="preserve">2026-10-05</w:t>
       </w:r>
     </w:p>
     <w:bookmarkStart w:id="13" w:name="reshaping-data"/>
@@ -229,7 +229,7 @@
                     <a:graphicData uri="http://schemas.openxmlformats.org/drawingml/2006/picture">
                       <pic:pic>
                         <pic:nvPicPr>
-                          <pic:cNvPr descr="/Applications/Positron.app/Contents/Resources/app/quarto/share/formats/docx/note.png" id="12" name="Picture"/>
+                          <pic:cNvPr descr="/opt/quarto/share/formats/docx/note.png" id="12" name="Picture"/>
                           <pic:cNvPicPr>
                             <a:picLocks noChangeArrowheads="1" noChangeAspect="1"/>
                           </pic:cNvPicPr>
@@ -2804,7 +2804,7 @@
                     <a:graphicData uri="http://schemas.openxmlformats.org/drawingml/2006/picture">
                       <pic:pic>
                         <pic:nvPicPr>
-                          <pic:cNvPr descr="/Applications/Positron.app/Contents/Resources/app/quarto/share/formats/docx/tip.png" id="20" name="Picture"/>
+                          <pic:cNvPr descr="/opt/quarto/share/formats/docx/tip.png" id="20" name="Picture"/>
                           <pic:cNvPicPr>
                             <a:picLocks noChangeArrowheads="1" noChangeAspect="1"/>
                           </pic:cNvPicPr>
@@ -3659,7 +3659,7 @@
                     <a:graphicData uri="http://schemas.openxmlformats.org/drawingml/2006/picture">
                       <pic:pic>
                         <pic:nvPicPr>
-                          <pic:cNvPr descr="/Applications/Positron.app/Contents/Resources/app/quarto/share/formats/docx/warning.png" id="26" name="Picture"/>
+                          <pic:cNvPr descr="/opt/quarto/share/formats/docx/warning.png" id="26" name="Picture"/>
                           <pic:cNvPicPr>
                             <a:picLocks noChangeArrowheads="1" noChangeAspect="1"/>
                           </pic:cNvPicPr>

</xml_diff>